<commit_message>
Stage 8 review fixes: F-030
</commit_message>
<xml_diff>
--- a/output/archive/DurnesswickData/TechTransfer/Local_Processes/2024/pilot-lot-handoff_091924_revA.docx
+++ b/output/archive/DurnesswickData/TechTransfer/Local_Processes/2024/pilot-lot-handoff_091924_revA.docx
@@ -31,7 +31,7 @@
     </w:p>
     <w:p>
       <w:r>
-        <w:t>Report no. F-R-2024-0094-A</w:t>
+        <w:t>Revision A</w:t>
       </w:r>
     </w:p>
     <w:p>
@@ -69,7 +69,7 @@
     </w:p>
     <w:p>
       <w:r>
-        <w:t>Every field below is required. A handoff with a blank field is returned to the sender before the scale team opens the lot record.</w:t>
+        <w:t>Each field must contain relevant information or a justified not-applicable entry. For example, a true solution has no dispersed-particle size to report. Unexplained blanks are returned before the scale team accepts the handoff.</w:t>
       </w:r>
     </w:p>
     <w:p>
@@ -383,7 +383,7 @@
               <w:rPr>
                 <w:sz w:val="18"/>
               </w:rPr>
-              <w:t>D50 and span in µm, the method and the date measured</w:t>
+              <w:t>Applicable size percentiles in µm; span is dimensionless. State distribution basis, method and date, or justify not applicable.</w:t>
             </w:r>
           </w:p>
         </w:tc>
@@ -522,7 +522,7 @@
           <w:i/>
           <w:sz w:val="18"/>
         </w:rPr>
-        <w:t>Higher loading improves the dose delivered per unit of blend but raises the viscosity risk at pilot scale. Where a lead formulation is selected on dose grounds, the trade-off against that risk is written into the handoff in one short paragraph, not left for the scale team to find.</w:t>
+        <w:t>Higher active loading increases active content per unit mass of blend. Effects on viscosity, flow, mixing and dose uniformity depend on formulation and process. The handoff states observed trade-offs and unresolved scale risks rather than assuming the same effect for every formulation.</w:t>
       </w:r>
     </w:p>
     <w:p>
@@ -536,7 +536,7 @@
     </w:p>
     <w:p>
       <w:r>
-        <w:t>Particle sizes are given in µm. The handoff states the measurement method and whether the sample was wet or dry. Where the material is measured both before and after blending, both values are given, with the blend step named, so a change in size can be traced to the step that caused it.</w:t>
+        <w:t>Particle-size percentiles are given in µm; distribution span is dimensionless. State method, distribution basis and wet or dry preparation. If measurements exist before and after blending, cite both source records. A difference alone does not establish which step caused it.</w:t>
       </w:r>
     </w:p>
     <w:p>
@@ -555,7 +555,7 @@
     </w:p>
     <w:p>
       <w:r>
-        <w:t>The following risks were open when this note was approved. Each has a named owner and must be closed or accepted before the scale gate.</w:t>
+        <w:t>The handoff identifies actual open risks for the pilot lot, with an owner and disposition before the scale gate. The following are prompts for review, not findings for a particular lot.</w:t>
       </w:r>
     </w:p>
     <w:p>
@@ -565,7 +565,7 @@
         <w:keepLines/>
       </w:pPr>
       <w:r>
-        <w:t>Blend flow at the selected loading has not yet been checked on a pilot blender. This is to be done before the scale gate.</w:t>
+        <w:t>Has blend flow been assessed under intended pilot-scale conditions?</w:t>
       </w:r>
     </w:p>
     <w:p>
@@ -575,7 +575,7 @@
         <w:keepLines/>
       </w:pPr>
       <w:r>
-        <w:t>One excipient is sensitive to moisture. The storage conditions for the lot are to be confirmed with Sample Management.</w:t>
+        <w:t>Do excipient moisture sensitivity and storage requirements need further control?</w:t>
       </w:r>
     </w:p>
     <w:p>
@@ -585,7 +585,7 @@
         <w:keepLines/>
       </w:pPr>
       <w:r>
-        <w:t>Particle size drifts on milling between runs. Size is to be re-measured on each pilot lot and not carried forward from the last one.</w:t>
+        <w:t>Are milling and particle-size results reproducible under the intended process?</w:t>
       </w:r>
     </w:p>
     <w:p>
@@ -594,7 +594,7 @@
         <w:keepLines/>
       </w:pPr>
       <w:r>
-        <w:t>The dose assumption depends on a single literature basis that the group has not yet checked against its own bench data.</w:t>
+        <w:t>Is the dose assumption supported by an identified source, and what remains unverified?</w:t>
       </w:r>
     </w:p>
     <w:p>
@@ -613,7 +613,7 @@
     </w:p>
     <w:p>
       <w:r>
-        <w:t>This note is approved for use from the date of issue. It replaces the informal handoff email used for the previous pilot lots. The local master applies to this note during the transition period, and the recipe card and accession numbers quoted in it are the local ones.</w:t>
+        <w:t>This note is approved for use from the date of issue. The local master applies during the transition period; recipe-card and accession references retain their local identities.</w:t>
       </w:r>
     </w:p>
     <w:p/>

</xml_diff>